<commit_message>
Add coffee sales data and update project documents
</commit_message>
<xml_diff>
--- a/documentation/meetings/Meeting_01.docx
+++ b/documentation/meetings/Meeting_01.docx
@@ -286,8 +286,8 @@
         <w:tblLook w:val="04A0" w:firstRow="1" w:lastRow="0" w:firstColumn="1" w:lastColumn="0" w:noHBand="0" w:noVBand="1"/>
       </w:tblPr>
       <w:tblGrid>
-        <w:gridCol w:w="2652"/>
-        <w:gridCol w:w="2261"/>
+        <w:gridCol w:w="3078"/>
+        <w:gridCol w:w="1835"/>
         <w:gridCol w:w="2516"/>
         <w:gridCol w:w="2723"/>
       </w:tblGrid>
@@ -297,7 +297,7 @@
         </w:trPr>
         <w:tc>
           <w:tcPr>
-            <w:tcW w:w="2652" w:type="dxa"/>
+            <w:tcW w:w="3078" w:type="dxa"/>
           </w:tcPr>
           <w:p>
             <w:r>
@@ -310,7 +310,7 @@
         </w:tc>
         <w:tc>
           <w:tcPr>
-            <w:tcW w:w="2261" w:type="dxa"/>
+            <w:tcW w:w="1835" w:type="dxa"/>
           </w:tcPr>
           <w:p>
             <w:pPr>
@@ -359,7 +359,7 @@
         </w:trPr>
         <w:tc>
           <w:tcPr>
-            <w:tcW w:w="2652" w:type="dxa"/>
+            <w:tcW w:w="3078" w:type="dxa"/>
           </w:tcPr>
           <w:p>
             <w:r>
@@ -369,7 +369,7 @@
         </w:tc>
         <w:tc>
           <w:tcPr>
-            <w:tcW w:w="2261" w:type="dxa"/>
+            <w:tcW w:w="1835" w:type="dxa"/>
           </w:tcPr>
           <w:p>
             <w:r>
@@ -404,38 +404,17 @@
         </w:trPr>
         <w:tc>
           <w:tcPr>
-            <w:tcW w:w="2652" w:type="dxa"/>
-          </w:tcPr>
-          <w:p>
-            <w:proofErr w:type="spellStart"/>
-            <w:r>
-              <w:t>Singappuli</w:t>
-            </w:r>
-            <w:proofErr w:type="spellEnd"/>
-            <w:r>
-              <w:t xml:space="preserve"> Arachchige </w:t>
-            </w:r>
-            <w:proofErr w:type="spellStart"/>
-            <w:r>
-              <w:t>Isuru</w:t>
-            </w:r>
-            <w:proofErr w:type="spellEnd"/>
-            <w:r>
-              <w:t xml:space="preserve"> </w:t>
-            </w:r>
-            <w:proofErr w:type="spellStart"/>
-            <w:r>
-              <w:t>Dayanga</w:t>
-            </w:r>
-            <w:proofErr w:type="spellEnd"/>
-            <w:r>
-              <w:t xml:space="preserve"> Samarakoon</w:t>
-            </w:r>
-          </w:p>
-        </w:tc>
-        <w:tc>
-          <w:tcPr>
-            <w:tcW w:w="2261" w:type="dxa"/>
+            <w:tcW w:w="3078" w:type="dxa"/>
+          </w:tcPr>
+          <w:p>
+            <w:r>
+              <w:t>Singappuli Arachchige Isuru Dayanga Samarakoon</w:t>
+            </w:r>
+          </w:p>
+        </w:tc>
+        <w:tc>
+          <w:tcPr>
+            <w:tcW w:w="1835" w:type="dxa"/>
           </w:tcPr>
           <w:p>
             <w:r>
@@ -470,7 +449,7 @@
         </w:trPr>
         <w:tc>
           <w:tcPr>
-            <w:tcW w:w="2652" w:type="dxa"/>
+            <w:tcW w:w="3078" w:type="dxa"/>
           </w:tcPr>
           <w:p>
             <w:r>
@@ -480,7 +459,7 @@
         </w:tc>
         <w:tc>
           <w:tcPr>
-            <w:tcW w:w="2261" w:type="dxa"/>
+            <w:tcW w:w="1835" w:type="dxa"/>
           </w:tcPr>
           <w:p>
             <w:r>
@@ -827,7 +806,7 @@
           </w:tcPr>
           <w:p>
             <w:r>
-              <w:t>To Do</w:t>
+              <w:t>Done</w:t>
             </w:r>
           </w:p>
         </w:tc>
@@ -882,7 +861,7 @@
           </w:tcPr>
           <w:p>
             <w:r>
-              <w:t>To Do</w:t>
+              <w:t>Done</w:t>
             </w:r>
           </w:p>
         </w:tc>
@@ -937,7 +916,7 @@
           </w:tcPr>
           <w:p>
             <w:r>
-              <w:t>To Do</w:t>
+              <w:t>Done</w:t>
             </w:r>
           </w:p>
         </w:tc>
@@ -992,7 +971,7 @@
           </w:tcPr>
           <w:p>
             <w:r>
-              <w:t>To Do</w:t>
+              <w:t>Done</w:t>
             </w:r>
           </w:p>
         </w:tc>
@@ -1047,7 +1026,7 @@
           </w:tcPr>
           <w:p>
             <w:r>
-              <w:t>To Do</w:t>
+              <w:t>Done</w:t>
             </w:r>
           </w:p>
         </w:tc>
@@ -1102,7 +1081,7 @@
           </w:tcPr>
           <w:p>
             <w:r>
-              <w:t>To Do</w:t>
+              <w:t>Done</w:t>
             </w:r>
           </w:p>
         </w:tc>
@@ -1157,7 +1136,7 @@
           </w:tcPr>
           <w:p>
             <w:r>
-              <w:t>To Do</w:t>
+              <w:t>Done</w:t>
             </w:r>
           </w:p>
         </w:tc>
@@ -1212,7 +1191,7 @@
           </w:tcPr>
           <w:p>
             <w:r>
-              <w:t>To Do</w:t>
+              <w:t>Done</w:t>
             </w:r>
           </w:p>
         </w:tc>
@@ -1267,7 +1246,7 @@
           </w:tcPr>
           <w:p>
             <w:r>
-              <w:t>To Do</w:t>
+              <w:t>Done</w:t>
             </w:r>
           </w:p>
         </w:tc>
@@ -1322,7 +1301,7 @@
           </w:tcPr>
           <w:p>
             <w:r>
-              <w:t>In Progress</w:t>
+              <w:t>Done</w:t>
             </w:r>
           </w:p>
         </w:tc>
@@ -1894,7 +1873,7 @@
           </w:tcPr>
           <w:p>
             <w:r>
-              <w:t>To Do</w:t>
+              <w:t>Done</w:t>
             </w:r>
           </w:p>
         </w:tc>
@@ -1939,7 +1918,7 @@
           </w:tcPr>
           <w:p>
             <w:r>
-              <w:t>To Do</w:t>
+              <w:t>Done</w:t>
             </w:r>
           </w:p>
         </w:tc>
@@ -1984,7 +1963,7 @@
           </w:tcPr>
           <w:p>
             <w:r>
-              <w:t>To Do</w:t>
+              <w:t>Done</w:t>
             </w:r>
           </w:p>
         </w:tc>
@@ -2029,7 +2008,7 @@
           </w:tcPr>
           <w:p>
             <w:r>
-              <w:t>To Do</w:t>
+              <w:t>Done</w:t>
             </w:r>
           </w:p>
         </w:tc>
@@ -2074,7 +2053,7 @@
           </w:tcPr>
           <w:p>
             <w:r>
-              <w:t>To Do</w:t>
+              <w:t>Done</w:t>
             </w:r>
           </w:p>
         </w:tc>
@@ -2119,7 +2098,7 @@
           </w:tcPr>
           <w:p>
             <w:r>
-              <w:t>To Do</w:t>
+              <w:t>Done</w:t>
             </w:r>
           </w:p>
         </w:tc>
@@ -2160,9 +2139,385 @@
     </w:p>
     <w:p>
       <w:r>
-        <w:t>The team should retain supporting evidence such as the Trello board, task assignments, GitHub repository activity, meeting screenshots (where appropriate), and updated meeting minutes as evidence of project planning and collaboration.</w:t>
+        <w:t>T</w:t>
+      </w:r>
+      <w:r>
+        <w:t>rello Board</w:t>
+      </w:r>
+      <w:r>
+        <w:t xml:space="preserve"> - </w:t>
+      </w:r>
+      <w:hyperlink r:id="rId6" w:history="1">
+        <w:r>
+          <w:rPr>
+            <w:rStyle w:val="Hyperlink"/>
+          </w:rPr>
+          <w:t>Link</w:t>
+        </w:r>
+      </w:hyperlink>
+    </w:p>
+    <w:p>
+      <w:r>
+        <w:lastRenderedPageBreak/>
+        <w:drawing>
+          <wp:inline distT="0" distB="0" distL="0" distR="0" wp14:anchorId="67FFB480" wp14:editId="54F136A3">
+            <wp:extent cx="6309360" cy="2427605"/>
+            <wp:effectExtent l="0" t="0" r="0" b="0"/>
+            <wp:docPr id="1746885966" name="Picture 2"/>
+            <wp:cNvGraphicFramePr>
+              <a:graphicFrameLocks xmlns:a="http://schemas.openxmlformats.org/drawingml/2006/main" noChangeAspect="1"/>
+            </wp:cNvGraphicFramePr>
+            <a:graphic xmlns:a="http://schemas.openxmlformats.org/drawingml/2006/main">
+              <a:graphicData uri="http://schemas.openxmlformats.org/drawingml/2006/picture">
+                <pic:pic xmlns:pic="http://schemas.openxmlformats.org/drawingml/2006/picture">
+                  <pic:nvPicPr>
+                    <pic:cNvPr id="0" name="Picture 6"/>
+                    <pic:cNvPicPr>
+                      <a:picLocks noChangeAspect="1" noChangeArrowheads="1"/>
+                    </pic:cNvPicPr>
+                  </pic:nvPicPr>
+                  <pic:blipFill>
+                    <a:blip r:embed="rId7">
+                      <a:extLst>
+                        <a:ext uri="{28A0092B-C50C-407E-A947-70E740481C1C}">
+                          <a14:useLocalDpi xmlns:a14="http://schemas.microsoft.com/office/drawing/2010/main" val="0"/>
+                        </a:ext>
+                      </a:extLst>
+                    </a:blip>
+                    <a:srcRect/>
+                    <a:stretch>
+                      <a:fillRect/>
+                    </a:stretch>
+                  </pic:blipFill>
+                  <pic:spPr bwMode="auto">
+                    <a:xfrm>
+                      <a:off x="0" y="0"/>
+                      <a:ext cx="6309360" cy="2427605"/>
+                    </a:xfrm>
+                    <a:prstGeom prst="rect">
+                      <a:avLst/>
+                    </a:prstGeom>
+                    <a:noFill/>
+                    <a:ln>
+                      <a:noFill/>
+                    </a:ln>
+                  </pic:spPr>
+                </pic:pic>
+              </a:graphicData>
+            </a:graphic>
+          </wp:inline>
+        </w:drawing>
       </w:r>
     </w:p>
+    <w:p/>
+    <w:p>
+      <w:r>
+        <w:t>Github Repository</w:t>
+      </w:r>
+      <w:r>
+        <w:t xml:space="preserve"> - </w:t>
+      </w:r>
+      <w:hyperlink r:id="rId8" w:history="1">
+        <w:r>
+          <w:rPr>
+            <w:rStyle w:val="Hyperlink"/>
+          </w:rPr>
+          <w:t>Link</w:t>
+        </w:r>
+      </w:hyperlink>
+    </w:p>
+    <w:p>
+      <w:r>
+        <w:drawing>
+          <wp:inline distT="0" distB="0" distL="0" distR="0" wp14:anchorId="52F2BC37" wp14:editId="50E290EE">
+            <wp:extent cx="6309360" cy="3113405"/>
+            <wp:effectExtent l="0" t="0" r="0" b="0"/>
+            <wp:docPr id="1591667464" name="Picture 1"/>
+            <wp:cNvGraphicFramePr>
+              <a:graphicFrameLocks xmlns:a="http://schemas.openxmlformats.org/drawingml/2006/main" noChangeAspect="1"/>
+            </wp:cNvGraphicFramePr>
+            <a:graphic xmlns:a="http://schemas.openxmlformats.org/drawingml/2006/main">
+              <a:graphicData uri="http://schemas.openxmlformats.org/drawingml/2006/picture">
+                <pic:pic xmlns:pic="http://schemas.openxmlformats.org/drawingml/2006/picture">
+                  <pic:nvPicPr>
+                    <pic:cNvPr id="1591667464" name=""/>
+                    <pic:cNvPicPr/>
+                  </pic:nvPicPr>
+                  <pic:blipFill>
+                    <a:blip r:embed="rId9"/>
+                    <a:stretch>
+                      <a:fillRect/>
+                    </a:stretch>
+                  </pic:blipFill>
+                  <pic:spPr>
+                    <a:xfrm>
+                      <a:off x="0" y="0"/>
+                      <a:ext cx="6309360" cy="3113405"/>
+                    </a:xfrm>
+                    <a:prstGeom prst="rect">
+                      <a:avLst/>
+                    </a:prstGeom>
+                  </pic:spPr>
+                </pic:pic>
+              </a:graphicData>
+            </a:graphic>
+          </wp:inline>
+        </w:drawing>
+      </w:r>
+    </w:p>
+    <w:p>
+      <w:r>
+        <w:t>Dataset</w:t>
+      </w:r>
+    </w:p>
+    <w:tbl>
+      <w:tblPr>
+        <w:tblW w:w="10152" w:type="dxa"/>
+        <w:tblBorders>
+          <w:top w:val="single" w:sz="2" w:space="0" w:color="auto"/>
+          <w:left w:val="single" w:sz="2" w:space="0" w:color="auto"/>
+          <w:bottom w:val="single" w:sz="2" w:space="0" w:color="auto"/>
+          <w:right w:val="single" w:sz="2" w:space="0" w:color="auto"/>
+        </w:tblBorders>
+        <w:shd w:val="clear" w:color="auto" w:fill="FFFFFF"/>
+        <w:tblLook w:val="04A0" w:firstRow="1" w:lastRow="0" w:firstColumn="1" w:lastColumn="0" w:noHBand="0" w:noVBand="1"/>
+      </w:tblPr>
+      <w:tblGrid>
+        <w:gridCol w:w="5076"/>
+        <w:gridCol w:w="5076"/>
+      </w:tblGrid>
+      <w:tr>
+        <w:tc>
+          <w:tcPr>
+            <w:tcW w:w="5076" w:type="dxa"/>
+            <w:tcBorders>
+              <w:top w:val="single" w:sz="4" w:space="0" w:color="000000"/>
+              <w:left w:val="single" w:sz="4" w:space="0" w:color="000000"/>
+              <w:bottom w:val="single" w:sz="4" w:space="0" w:color="000000"/>
+              <w:right w:val="single" w:sz="4" w:space="0" w:color="000000"/>
+            </w:tcBorders>
+            <w:shd w:val="clear" w:color="auto" w:fill="FFFFFF"/>
+            <w:hideMark/>
+          </w:tcPr>
+          <w:p>
+            <w:r>
+              <w:rPr>
+                <w:b/>
+                <w:bCs/>
+              </w:rPr>
+              <w:t>Scope</w:t>
+            </w:r>
+          </w:p>
+        </w:tc>
+        <w:tc>
+          <w:tcPr>
+            <w:tcW w:w="5076" w:type="dxa"/>
+            <w:tcBorders>
+              <w:top w:val="single" w:sz="4" w:space="0" w:color="000000"/>
+              <w:left w:val="single" w:sz="4" w:space="0" w:color="000000"/>
+              <w:bottom w:val="single" w:sz="4" w:space="0" w:color="000000"/>
+              <w:right w:val="single" w:sz="4" w:space="0" w:color="000000"/>
+            </w:tcBorders>
+            <w:shd w:val="clear" w:color="auto" w:fill="FFFFFF"/>
+            <w:hideMark/>
+          </w:tcPr>
+          <w:p>
+            <w:r>
+              <w:rPr>
+                <w:b/>
+                <w:bCs/>
+              </w:rPr>
+              <w:t>Research Question</w:t>
+            </w:r>
+          </w:p>
+        </w:tc>
+      </w:tr>
+      <w:tr>
+        <w:tc>
+          <w:tcPr>
+            <w:tcW w:w="5076" w:type="dxa"/>
+            <w:tcBorders>
+              <w:top w:val="single" w:sz="4" w:space="0" w:color="000000"/>
+              <w:left w:val="single" w:sz="4" w:space="0" w:color="000000"/>
+              <w:bottom w:val="single" w:sz="4" w:space="0" w:color="000000"/>
+              <w:right w:val="single" w:sz="4" w:space="0" w:color="000000"/>
+            </w:tcBorders>
+            <w:shd w:val="clear" w:color="auto" w:fill="FFFFFF"/>
+            <w:hideMark/>
+          </w:tcPr>
+          <w:p>
+            <w:r>
+              <w:t>Overarching</w:t>
+            </w:r>
+          </w:p>
+        </w:tc>
+        <w:tc>
+          <w:tcPr>
+            <w:tcW w:w="5076" w:type="dxa"/>
+            <w:tcBorders>
+              <w:top w:val="single" w:sz="4" w:space="0" w:color="000000"/>
+              <w:left w:val="single" w:sz="4" w:space="0" w:color="000000"/>
+              <w:bottom w:val="single" w:sz="4" w:space="0" w:color="000000"/>
+              <w:right w:val="single" w:sz="4" w:space="0" w:color="000000"/>
+            </w:tcBorders>
+            <w:shd w:val="clear" w:color="auto" w:fill="FFFFFF"/>
+            <w:hideMark/>
+          </w:tcPr>
+          <w:p>
+            <w:r>
+              <w:t>How do coffee shop sales vary in terms of when customers buy, where revenue is generated, and the relationship between units sold and daily revenue during the morning rush?</w:t>
+            </w:r>
+          </w:p>
+        </w:tc>
+      </w:tr>
+      <w:tr>
+        <w:tc>
+          <w:tcPr>
+            <w:tcW w:w="5076" w:type="dxa"/>
+            <w:tcBorders>
+              <w:top w:val="single" w:sz="4" w:space="0" w:color="000000"/>
+              <w:left w:val="single" w:sz="4" w:space="0" w:color="000000"/>
+              <w:bottom w:val="single" w:sz="4" w:space="0" w:color="000000"/>
+              <w:right w:val="single" w:sz="4" w:space="0" w:color="000000"/>
+            </w:tcBorders>
+            <w:shd w:val="clear" w:color="auto" w:fill="FFFFFF"/>
+            <w:hideMark/>
+          </w:tcPr>
+          <w:p>
+            <w:r>
+              <w:t>Chart 1 – When</w:t>
+            </w:r>
+          </w:p>
+        </w:tc>
+        <w:tc>
+          <w:tcPr>
+            <w:tcW w:w="5076" w:type="dxa"/>
+            <w:tcBorders>
+              <w:top w:val="single" w:sz="4" w:space="0" w:color="000000"/>
+              <w:left w:val="single" w:sz="4" w:space="0" w:color="000000"/>
+              <w:bottom w:val="single" w:sz="4" w:space="0" w:color="000000"/>
+              <w:right w:val="single" w:sz="4" w:space="0" w:color="000000"/>
+            </w:tcBorders>
+            <w:shd w:val="clear" w:color="auto" w:fill="FFFFFF"/>
+            <w:hideMark/>
+          </w:tcPr>
+          <w:p>
+            <w:r>
+              <w:t>When are coffee shop transactions busiest across different days of the week and hours of the day?</w:t>
+            </w:r>
+          </w:p>
+        </w:tc>
+      </w:tr>
+      <w:tr>
+        <w:tc>
+          <w:tcPr>
+            <w:tcW w:w="5076" w:type="dxa"/>
+            <w:tcBorders>
+              <w:top w:val="single" w:sz="4" w:space="0" w:color="000000"/>
+              <w:left w:val="single" w:sz="4" w:space="0" w:color="000000"/>
+              <w:bottom w:val="single" w:sz="4" w:space="0" w:color="000000"/>
+              <w:right w:val="single" w:sz="4" w:space="0" w:color="000000"/>
+            </w:tcBorders>
+            <w:shd w:val="clear" w:color="auto" w:fill="FFFFFF"/>
+            <w:hideMark/>
+          </w:tcPr>
+          <w:p/>
+        </w:tc>
+        <w:tc>
+          <w:tcPr>
+            <w:tcW w:w="5076" w:type="dxa"/>
+            <w:tcBorders>
+              <w:top w:val="single" w:sz="4" w:space="0" w:color="000000"/>
+              <w:left w:val="single" w:sz="4" w:space="0" w:color="000000"/>
+              <w:bottom w:val="single" w:sz="4" w:space="0" w:color="000000"/>
+              <w:right w:val="single" w:sz="4" w:space="0" w:color="000000"/>
+            </w:tcBorders>
+            <w:shd w:val="clear" w:color="auto" w:fill="FFFFFF"/>
+            <w:hideMark/>
+          </w:tcPr>
+          <w:p/>
+        </w:tc>
+      </w:tr>
+      <w:tr>
+        <w:tc>
+          <w:tcPr>
+            <w:tcW w:w="5076" w:type="dxa"/>
+            <w:tcBorders>
+              <w:top w:val="single" w:sz="4" w:space="0" w:color="000000"/>
+              <w:left w:val="single" w:sz="4" w:space="0" w:color="000000"/>
+              <w:bottom w:val="single" w:sz="4" w:space="0" w:color="000000"/>
+              <w:right w:val="single" w:sz="4" w:space="0" w:color="000000"/>
+            </w:tcBorders>
+            <w:shd w:val="clear" w:color="auto" w:fill="FFFFFF"/>
+            <w:hideMark/>
+          </w:tcPr>
+          <w:p>
+            <w:r>
+              <w:lastRenderedPageBreak/>
+              <w:t>Chart 2 – Where</w:t>
+            </w:r>
+          </w:p>
+        </w:tc>
+        <w:tc>
+          <w:tcPr>
+            <w:tcW w:w="5076" w:type="dxa"/>
+            <w:tcBorders>
+              <w:top w:val="single" w:sz="4" w:space="0" w:color="000000"/>
+              <w:left w:val="single" w:sz="4" w:space="0" w:color="000000"/>
+              <w:bottom w:val="single" w:sz="4" w:space="0" w:color="000000"/>
+              <w:right w:val="single" w:sz="4" w:space="0" w:color="000000"/>
+            </w:tcBorders>
+            <w:shd w:val="clear" w:color="auto" w:fill="FFFFFF"/>
+            <w:hideMark/>
+          </w:tcPr>
+          <w:p>
+            <w:r>
+              <w:t>How does revenue vary across the three coffee shop locations?</w:t>
+            </w:r>
+          </w:p>
+        </w:tc>
+      </w:tr>
+      <w:tr>
+        <w:tc>
+          <w:tcPr>
+            <w:tcW w:w="5076" w:type="dxa"/>
+            <w:tcBorders>
+              <w:top w:val="single" w:sz="4" w:space="0" w:color="000000"/>
+              <w:left w:val="single" w:sz="4" w:space="0" w:color="000000"/>
+              <w:bottom w:val="single" w:sz="4" w:space="0" w:color="000000"/>
+              <w:right w:val="single" w:sz="4" w:space="0" w:color="000000"/>
+            </w:tcBorders>
+            <w:shd w:val="clear" w:color="auto" w:fill="FFFFFF"/>
+            <w:hideMark/>
+          </w:tcPr>
+          <w:p>
+            <w:r>
+              <w:t>Chart 3 – How Much</w:t>
+            </w:r>
+          </w:p>
+        </w:tc>
+        <w:tc>
+          <w:tcPr>
+            <w:tcW w:w="5076" w:type="dxa"/>
+            <w:tcBorders>
+              <w:top w:val="single" w:sz="4" w:space="0" w:color="000000"/>
+              <w:left w:val="single" w:sz="4" w:space="0" w:color="000000"/>
+              <w:bottom w:val="single" w:sz="4" w:space="0" w:color="000000"/>
+              <w:right w:val="single" w:sz="4" w:space="0" w:color="000000"/>
+            </w:tcBorders>
+            <w:shd w:val="clear" w:color="auto" w:fill="FFFFFF"/>
+            <w:hideMark/>
+          </w:tcPr>
+          <w:p>
+            <w:r>
+              <w:t>What is the relationship between daily units sold and daily revenue across the coffee shop locations?</w:t>
+            </w:r>
+          </w:p>
+        </w:tc>
+      </w:tr>
+    </w:tbl>
+    <w:p/>
+    <w:p/>
     <w:p/>
     <w:p>
       <w:pPr>
@@ -2340,7 +2695,7 @@
   <w:abstractNum w:abstractNumId="8" w15:restartNumberingAfterBreak="0">
     <w:nsid w:val="FFFFFF89"/>
     <w:multiLevelType w:val="singleLevel"/>
-    <w:tmpl w:val="29761A62"/>
+    <w:tmpl w:val="9FA85742"/>
     <w:lvl w:ilvl="0">
       <w:start w:val="1"/>
       <w:numFmt w:val="bullet"/>
@@ -13771,6 +14126,29 @@
       </w:tcPr>
     </w:tblStylePr>
   </w:style>
+  <w:style w:type="character" w:styleId="Hyperlink">
+    <w:name w:val="Hyperlink"/>
+    <w:basedOn w:val="DefaultParagraphFont"/>
+    <w:uiPriority w:val="99"/>
+    <w:unhideWhenUsed/>
+    <w:rsid w:val="00490B26"/>
+    <w:rPr>
+      <w:color w:val="0000FF" w:themeColor="hyperlink"/>
+      <w:u w:val="single"/>
+    </w:rPr>
+  </w:style>
+  <w:style w:type="character" w:styleId="UnresolvedMention">
+    <w:name w:val="Unresolved Mention"/>
+    <w:basedOn w:val="DefaultParagraphFont"/>
+    <w:uiPriority w:val="99"/>
+    <w:semiHidden/>
+    <w:unhideWhenUsed/>
+    <w:rsid w:val="00490B26"/>
+    <w:rPr>
+      <w:color w:val="605E5C"/>
+      <w:shd w:val="clear" w:color="auto" w:fill="E1DFDD"/>
+    </w:rPr>
+  </w:style>
 </w:styles>
 </file>
 

</xml_diff>

<commit_message>
Update meeting and sprint documentation
</commit_message>
<xml_diff>
--- a/documentation/meetings/Meeting_01.docx
+++ b/documentation/meetings/Meeting_01.docx
@@ -11,7 +11,23 @@
           <w:b/>
           <w:sz w:val="32"/>
         </w:rPr>
-        <w:t>CIS4014-N Interactive Visualisation – Group 4</w:t>
+        <w:t xml:space="preserve">CIS4014-N Interactive </w:t>
+      </w:r>
+      <w:proofErr w:type="spellStart"/>
+      <w:r>
+        <w:rPr>
+          <w:b/>
+          <w:sz w:val="32"/>
+        </w:rPr>
+        <w:t>Visualisation</w:t>
+      </w:r>
+      <w:proofErr w:type="spellEnd"/>
+      <w:r>
+        <w:rPr>
+          <w:b/>
+          <w:sz w:val="32"/>
+        </w:rPr>
+        <w:t xml:space="preserve"> – Group 4</w:t>
       </w:r>
     </w:p>
     <w:p>
@@ -266,7 +282,23 @@
     </w:p>
     <w:p>
       <w:r>
-        <w:t>The purpose of the first team meeting was to establish the initial direction of the CIS4014-N Interactive Visualisation project, agree on a suitable project management approach, discuss the project topic and dataset, identify individual visualisation responsibilities, and establish the initial development plan for Week 01.</w:t>
+        <w:t xml:space="preserve">The purpose of the first team meeting was to establish the initial direction of the CIS4014-N Interactive </w:t>
+      </w:r>
+      <w:proofErr w:type="spellStart"/>
+      <w:r>
+        <w:t>Visualisation</w:t>
+      </w:r>
+      <w:proofErr w:type="spellEnd"/>
+      <w:r>
+        <w:t xml:space="preserve"> project, agree on a suitable project management approach, discuss the project topic and dataset, identify individual </w:t>
+      </w:r>
+      <w:proofErr w:type="spellStart"/>
+      <w:r>
+        <w:t>visualisation</w:t>
+      </w:r>
+      <w:proofErr w:type="spellEnd"/>
+      <w:r>
+        <w:t xml:space="preserve"> responsibilities, and establish the initial development plan for Week 01.</w:t>
       </w:r>
     </w:p>
     <w:p>
@@ -407,8 +439,29 @@
             <w:tcW w:w="3078" w:type="dxa"/>
           </w:tcPr>
           <w:p>
-            <w:r>
-              <w:t>Singappuli Arachchige Isuru Dayanga Samarakoon</w:t>
+            <w:proofErr w:type="spellStart"/>
+            <w:r>
+              <w:t>Singappuli</w:t>
+            </w:r>
+            <w:proofErr w:type="spellEnd"/>
+            <w:r>
+              <w:t xml:space="preserve"> Arachchige </w:t>
+            </w:r>
+            <w:proofErr w:type="spellStart"/>
+            <w:r>
+              <w:t>Isuru</w:t>
+            </w:r>
+            <w:proofErr w:type="spellEnd"/>
+            <w:r>
+              <w:t xml:space="preserve"> </w:t>
+            </w:r>
+            <w:proofErr w:type="spellStart"/>
+            <w:r>
+              <w:t>Dayanga</w:t>
+            </w:r>
+            <w:proofErr w:type="spellEnd"/>
+            <w:r>
+              <w:t xml:space="preserve"> Samarakoon</w:t>
             </w:r>
           </w:p>
         </w:tc>
@@ -503,7 +556,15 @@
         <w:pStyle w:val="ListBullet"/>
       </w:pPr>
       <w:r>
-        <w:t>Reviewed the main requirements of the Interactive Visualisation assignment.</w:t>
+        <w:t xml:space="preserve">Reviewed the main requirements of the Interactive </w:t>
+      </w:r>
+      <w:proofErr w:type="spellStart"/>
+      <w:r>
+        <w:t>Visualisation</w:t>
+      </w:r>
+      <w:proofErr w:type="spellEnd"/>
+      <w:r>
+        <w:t xml:space="preserve"> assignment.</w:t>
       </w:r>
     </w:p>
     <w:p>
@@ -511,7 +572,15 @@
         <w:pStyle w:val="ListBullet"/>
       </w:pPr>
       <w:r>
-        <w:t>Discussed the need for three individual visualisations, with one graph produced by each team member.</w:t>
+        <w:t xml:space="preserve">Discussed the need for three individual </w:t>
+      </w:r>
+      <w:proofErr w:type="spellStart"/>
+      <w:r>
+        <w:t>visualisations</w:t>
+      </w:r>
+      <w:proofErr w:type="spellEnd"/>
+      <w:r>
+        <w:t>, with one graph produced by each team member.</w:t>
       </w:r>
     </w:p>
     <w:p>
@@ -519,7 +588,15 @@
         <w:pStyle w:val="ListBullet"/>
       </w:pPr>
       <w:r>
-        <w:t>Discussed the importance of having one overarching investigation so that the three visualisations form one coherent team product.</w:t>
+        <w:t xml:space="preserve">Discussed the importance of having one overarching investigation so that the three </w:t>
+      </w:r>
+      <w:proofErr w:type="spellStart"/>
+      <w:r>
+        <w:t>visualisations</w:t>
+      </w:r>
+      <w:proofErr w:type="spellEnd"/>
+      <w:r>
+        <w:t xml:space="preserve"> form one coherent team product.</w:t>
       </w:r>
     </w:p>
     <w:p>
@@ -527,7 +604,15 @@
         <w:pStyle w:val="ListBullet"/>
       </w:pPr>
       <w:r>
-        <w:t>Discussed possible datasets and the need to select a dataset with sufficient variables for meaningful interactive visualisations.</w:t>
+        <w:t xml:space="preserve">Discussed possible datasets and the need to select a dataset with sufficient variables for meaningful interactive </w:t>
+      </w:r>
+      <w:proofErr w:type="spellStart"/>
+      <w:r>
+        <w:t>visualisations</w:t>
+      </w:r>
+      <w:proofErr w:type="spellEnd"/>
+      <w:r>
+        <w:t>.</w:t>
       </w:r>
     </w:p>
     <w:p>
@@ -535,7 +620,23 @@
         <w:pStyle w:val="ListBullet"/>
       </w:pPr>
       <w:r>
-        <w:t>Discussed using D3.js v7, JavaScript, HTML and CSS for the web-based visualisation.</w:t>
+        <w:t xml:space="preserve">Discussed using D3.js v7, JavaScript, HTML and CSS for </w:t>
+      </w:r>
+      <w:proofErr w:type="gramStart"/>
+      <w:r>
+        <w:t>the web</w:t>
+      </w:r>
+      <w:proofErr w:type="gramEnd"/>
+      <w:r>
+        <w:t xml:space="preserve">-based </w:t>
+      </w:r>
+      <w:proofErr w:type="spellStart"/>
+      <w:r>
+        <w:t>visualisation</w:t>
+      </w:r>
+      <w:proofErr w:type="spellEnd"/>
+      <w:r>
+        <w:t>.</w:t>
       </w:r>
     </w:p>
     <w:p>
@@ -574,7 +675,15 @@
     <w:p>
       <w:r>
         <w:lastRenderedPageBreak/>
-        <w:t>The team agreed to manage the project using a simplified Scrum approach because the project has a short development period of approximately four to five weeks. The work will be organised into weekly sprints. Trello will be used as the central task-management tool, while GitHub will be used for version control and project files.</w:t>
+        <w:t xml:space="preserve">The team agreed to manage the project using a simplified Scrum approach because the project has a short development period of approximately four to five weeks. The work will be </w:t>
+      </w:r>
+      <w:proofErr w:type="spellStart"/>
+      <w:r>
+        <w:t>organised</w:t>
+      </w:r>
+      <w:proofErr w:type="spellEnd"/>
+      <w:r>
+        <w:t xml:space="preserve"> into weekly sprints. Trello will be used as the central task-management tool, while GitHub will be used for version control and project files.</w:t>
       </w:r>
     </w:p>
     <w:p>
@@ -636,7 +745,15 @@
         <w:pStyle w:val="ListBullet"/>
       </w:pPr>
       <w:r>
-        <w:t>Sprint 5 / Finalisation – final fixes and documentation, if required.</w:t>
+        <w:t xml:space="preserve">Sprint 5 / </w:t>
+      </w:r>
+      <w:proofErr w:type="spellStart"/>
+      <w:r>
+        <w:t>Finalisation</w:t>
+      </w:r>
+      <w:proofErr w:type="spellEnd"/>
+      <w:r>
+        <w:t xml:space="preserve"> – final fixes and documentation, if required.</w:t>
       </w:r>
     </w:p>
     <w:p>
@@ -940,8 +1057,13 @@
             <w:tcW w:w="1987" w:type="dxa"/>
           </w:tcPr>
           <w:p>
-            <w:r>
-              <w:t>Analyse dataset and variables</w:t>
+            <w:proofErr w:type="spellStart"/>
+            <w:r>
+              <w:t>Analyse</w:t>
+            </w:r>
+            <w:proofErr w:type="spellEnd"/>
+            <w:r>
+              <w:t xml:space="preserve"> dataset and variables</w:t>
             </w:r>
           </w:p>
         </w:tc>
@@ -1006,7 +1128,7 @@
           </w:tcPr>
           <w:p>
             <w:r>
-              <w:t>Ilamperuma</w:t>
+              <w:t>All</w:t>
             </w:r>
           </w:p>
         </w:tc>
@@ -1753,7 +1875,15 @@
         <w:pStyle w:val="ListBullet"/>
       </w:pPr>
       <w:r>
-        <w:t>Each team member will be responsible for developing one individual interactive D3.js visualisation.</w:t>
+        <w:t xml:space="preserve">Each team member will be responsible for developing one individual interactive D3.js </w:t>
+      </w:r>
+      <w:proofErr w:type="spellStart"/>
+      <w:r>
+        <w:t>visualisation</w:t>
+      </w:r>
+      <w:proofErr w:type="spellEnd"/>
+      <w:r>
+        <w:t>.</w:t>
       </w:r>
     </w:p>
     <w:p>
@@ -1761,7 +1891,15 @@
         <w:pStyle w:val="ListBullet"/>
       </w:pPr>
       <w:r>
-        <w:t>The three visualisations will be connected through one overarching investigation and a common dashboard design.</w:t>
+        <w:t xml:space="preserve">The three </w:t>
+      </w:r>
+      <w:proofErr w:type="spellStart"/>
+      <w:r>
+        <w:t>visualisations</w:t>
+      </w:r>
+      <w:proofErr w:type="spellEnd"/>
+      <w:r>
+        <w:t xml:space="preserve"> will be connected through one overarching investigation and a common dashboard design.</w:t>
       </w:r>
     </w:p>
     <w:p>
@@ -2125,7 +2263,15 @@
     </w:p>
     <w:p>
       <w:r>
-        <w:t>Meeting 02 will review the selected dataset, finalise the overarching and individual research questions, confirm the three chart types, review the Trello Sprint 1 board, and begin the prototype/design stage.</w:t>
+        <w:t xml:space="preserve">Meeting 02 will review the selected dataset, </w:t>
+      </w:r>
+      <w:proofErr w:type="spellStart"/>
+      <w:r>
+        <w:t>finalise</w:t>
+      </w:r>
+      <w:proofErr w:type="spellEnd"/>
+      <w:r>
+        <w:t xml:space="preserve"> the overarching and individual research questions, confirm the three chart types, review the Trello Sprint 1 board, and begin the prototype/design stage.</w:t>
       </w:r>
     </w:p>
     <w:p>
@@ -2158,6 +2304,9 @@
     </w:p>
     <w:p>
       <w:r>
+        <w:rPr>
+          <w:noProof/>
+        </w:rPr>
         <w:lastRenderedPageBreak/>
         <w:drawing>
           <wp:inline distT="0" distB="0" distL="0" distR="0" wp14:anchorId="67FFB480" wp14:editId="54F136A3">
@@ -2211,8 +2360,13 @@
     </w:p>
     <w:p/>
     <w:p>
+      <w:proofErr w:type="spellStart"/>
       <w:r>
-        <w:t>Github Repository</w:t>
+        <w:t>Github</w:t>
+      </w:r>
+      <w:proofErr w:type="spellEnd"/>
+      <w:r>
+        <w:t xml:space="preserve"> Repository</w:t>
       </w:r>
       <w:r>
         <w:t xml:space="preserve"> - </w:t>
@@ -2228,6 +2382,9 @@
     </w:p>
     <w:p>
       <w:r>
+        <w:rPr>
+          <w:noProof/>
+        </w:rPr>
         <w:drawing>
           <wp:inline distT="0" distB="0" distL="0" distR="0" wp14:anchorId="52F2BC37" wp14:editId="50E290EE">
             <wp:extent cx="6309360" cy="3113405"/>
@@ -3364,6 +3521,7 @@
   <w:style w:type="character" w:default="1" w:styleId="DefaultParagraphFont">
     <w:name w:val="Default Paragraph Font"/>
     <w:uiPriority w:val="1"/>
+    <w:semiHidden/>
     <w:unhideWhenUsed/>
   </w:style>
   <w:style w:type="table" w:default="1" w:styleId="TableNormal">

</xml_diff>